<commit_message>
feat: add training materials for TRS calculation and Pareto/Ishikawa analysis exercises
</commit_message>
<xml_diff>
--- a/OI/a0_pareto_ishikawa/TP-Analyse-Pareto---Diagramme-d-Ishikawa.docx
+++ b/OI/a0_pareto_ishikawa/TP-Analyse-Pareto---Diagramme-d-Ishikawa.docx
@@ -4,30 +4,10 @@
   <w:body>
     <w:p>
       <w:pPr>
-        <w:pStyle w:val="Titre1"/>
+        <w:pStyle w:val="FirstParagraph"/>
       </w:pPr>
       <w:bookmarkStart w:id="0" w:name="X9dafbd6dcc8355bfb0328f33372be457ef6d4e4"/>
-      <w:proofErr w:type="gramStart"/>
-      <w:r>
-        <w:t>TP :</w:t>
-      </w:r>
-      <w:proofErr w:type="gramEnd"/>
-      <w:r>
-        <w:t xml:space="preserve"> </w:t>
-      </w:r>
       <w:proofErr w:type="spellStart"/>
-      <w:r>
-        <w:t>Optimisation</w:t>
-      </w:r>
-      <w:proofErr w:type="spellEnd"/>
-      <w:r>
-        <w:t xml:space="preserve"> de la Maintenance par les Outils LEAN</w:t>
-      </w:r>
-    </w:p>
-    <w:p>
-      <w:pPr>
-        <w:pStyle w:val="FirstParagraph"/>
-      </w:pPr>
       <w:proofErr w:type="gramStart"/>
       <w:r>
         <w:rPr>
@@ -36,12 +16,21 @@
         </w:rPr>
         <w:t>Thème</w:t>
       </w:r>
+      <w:proofErr w:type="spellEnd"/>
       <w:r>
         <w:t xml:space="preserve"> :</w:t>
       </w:r>
       <w:proofErr w:type="gramEnd"/>
       <w:r>
-        <w:t xml:space="preserve"> Analyse Pareto &amp; Diagramme d’Ishikawa </w:t>
+        <w:t xml:space="preserve"> </w:t>
+      </w:r>
+      <w:proofErr w:type="spellStart"/>
+      <w:r>
+        <w:t>Analyse</w:t>
+      </w:r>
+      <w:proofErr w:type="spellEnd"/>
+      <w:r>
+        <w:t xml:space="preserve"> Pareto &amp; Diagramme d’Ishikawa </w:t>
       </w:r>
     </w:p>
     <w:p>
@@ -57,10 +46,7 @@
         <w:t>Public</w:t>
       </w:r>
       <w:r>
-        <w:t xml:space="preserve"> </w:t>
-      </w:r>
-      <w:r>
-        <w:t>:</w:t>
+        <w:t xml:space="preserve"> :</w:t>
       </w:r>
       <w:proofErr w:type="gramEnd"/>
       <w:r>
@@ -123,7 +109,15 @@
       <w:bookmarkStart w:id="2" w:name="exercice-1-la-loi-de-pareto-1h30"/>
       <w:bookmarkEnd w:id="1"/>
       <w:r>
-        <w:t xml:space="preserve">2. Exercice </w:t>
+        <w:t xml:space="preserve">2. </w:t>
+      </w:r>
+      <w:proofErr w:type="spellStart"/>
+      <w:r>
+        <w:t>Activité</w:t>
+      </w:r>
+      <w:proofErr w:type="spellEnd"/>
+      <w:r>
+        <w:t xml:space="preserve"> </w:t>
       </w:r>
       <w:proofErr w:type="gramStart"/>
       <w:r>
@@ -539,7 +533,6 @@
       <w:bookmarkStart w:id="4" w:name="b.-travail-à-réaliser"/>
       <w:bookmarkEnd w:id="3"/>
       <w:r>
-        <w:lastRenderedPageBreak/>
         <w:t>B. Travail à réaliser</w:t>
       </w:r>
     </w:p>
@@ -600,6 +593,7 @@
         </w:numPr>
       </w:pPr>
       <w:r>
+        <w:lastRenderedPageBreak/>
         <w:t>Temps d’arrêt (min)</w:t>
       </w:r>
     </w:p>
@@ -635,6 +629,7 @@
           <w:numId w:val="2"/>
         </w:numPr>
       </w:pPr>
+      <w:proofErr w:type="spellStart"/>
       <w:proofErr w:type="gramStart"/>
       <w:r>
         <w:rPr>
@@ -643,11 +638,9 @@
         </w:rPr>
         <w:t>Graphique</w:t>
       </w:r>
-      <w:r>
-        <w:t xml:space="preserve"> </w:t>
-      </w:r>
-      <w:r>
-        <w:t>:</w:t>
+      <w:proofErr w:type="spellEnd"/>
+      <w:r>
+        <w:t xml:space="preserve"> :</w:t>
       </w:r>
       <w:proofErr w:type="gramEnd"/>
       <w:r>
@@ -730,7 +723,15 @@
       <w:bookmarkEnd w:id="2"/>
       <w:bookmarkEnd w:id="4"/>
       <w:r>
-        <w:t xml:space="preserve">3. Exercice </w:t>
+        <w:t xml:space="preserve">3. </w:t>
+      </w:r>
+      <w:proofErr w:type="spellStart"/>
+      <w:r>
+        <w:t>Activité</w:t>
+      </w:r>
+      <w:proofErr w:type="spellEnd"/>
+      <w:r>
+        <w:t xml:space="preserve"> </w:t>
       </w:r>
       <w:proofErr w:type="gramStart"/>
       <w:r>
@@ -899,10 +900,7 @@
         <w:t>MAIN D’OEUVRE</w:t>
       </w:r>
       <w:r>
-        <w:t xml:space="preserve"> </w:t>
-      </w:r>
-      <w:r>
-        <w:t>: Manque de formation sur le réseau, erreur de branchement lors d’un dépannage rapide…</w:t>
+        <w:t xml:space="preserve"> : Manque de formation sur le réseau, erreur de branchement lors d’un dépannage rapide…</w:t>
       </w:r>
     </w:p>
     <w:p>
@@ -977,7 +975,6 @@
       <w:bookmarkEnd w:id="5"/>
       <w:bookmarkEnd w:id="7"/>
       <w:r>
-        <w:lastRenderedPageBreak/>
         <w:t xml:space="preserve">4. Plan </w:t>
       </w:r>
       <w:proofErr w:type="spellStart"/>
@@ -994,11 +991,27 @@
         <w:pStyle w:val="FirstParagraph"/>
       </w:pPr>
       <w:r>
-        <w:t xml:space="preserve">Au vu des deux exercices, </w:t>
-      </w:r>
+        <w:t xml:space="preserve">Au vu des deux </w:t>
+      </w:r>
+      <w:proofErr w:type="spellStart"/>
+      <w:r>
+        <w:t>Activité</w:t>
+      </w:r>
+      <w:r>
+        <w:t>s</w:t>
+      </w:r>
+      <w:proofErr w:type="spellEnd"/>
+      <w:r>
+        <w:t xml:space="preserve">, </w:t>
+      </w:r>
+      <w:proofErr w:type="spellStart"/>
       <w:proofErr w:type="gramStart"/>
       <w:r>
-        <w:t>proposez :</w:t>
+        <w:t>proposez</w:t>
+      </w:r>
+      <w:proofErr w:type="spellEnd"/>
+      <w:r>
+        <w:t xml:space="preserve"> :</w:t>
       </w:r>
       <w:proofErr w:type="gramEnd"/>
       <w:r>

</xml_diff>

<commit_message>
feat: add instructional materials for Ishikawa and Pareto maintenance analysis exercises
</commit_message>
<xml_diff>
--- a/OI/a0_pareto_ishikawa/TP-Analyse-Pareto---Diagramme-d-Ishikawa.docx
+++ b/OI/a0_pareto_ishikawa/TP-Analyse-Pareto---Diagramme-d-Ishikawa.docx
@@ -532,7 +532,26 @@
       </w:pPr>
       <w:bookmarkStart w:id="4" w:name="b.-travail-à-réaliser"/>
       <w:bookmarkEnd w:id="3"/>
-      <w:r>
+    </w:p>
+    <w:p>
+      <w:pPr>
+        <w:rPr>
+          <w:rFonts w:eastAsiaTheme="majorEastAsia" w:cstheme="majorBidi"/>
+          <w:color w:val="0F4761" w:themeColor="accent1" w:themeShade="BF"/>
+          <w:sz w:val="28"/>
+          <w:szCs w:val="28"/>
+        </w:rPr>
+      </w:pPr>
+      <w:r>
+        <w:br w:type="page"/>
+      </w:r>
+    </w:p>
+    <w:p>
+      <w:pPr>
+        <w:pStyle w:val="Titre3"/>
+      </w:pPr>
+      <w:r>
+        <w:lastRenderedPageBreak/>
         <w:t>B. Travail à réaliser</w:t>
       </w:r>
     </w:p>
@@ -593,7 +612,6 @@
         </w:numPr>
       </w:pPr>
       <w:r>
-        <w:lastRenderedPageBreak/>
         <w:t>Temps d’arrêt (min)</w:t>
       </w:r>
     </w:p>
@@ -717,12 +735,26 @@
     </w:p>
     <w:p>
       <w:pPr>
-        <w:pStyle w:val="Titre2"/>
+        <w:rPr>
+          <w:rFonts w:asciiTheme="majorHAnsi" w:eastAsiaTheme="majorEastAsia" w:hAnsiTheme="majorHAnsi" w:cstheme="majorBidi"/>
+          <w:color w:val="0F4761" w:themeColor="accent1" w:themeShade="BF"/>
+          <w:sz w:val="32"/>
+          <w:szCs w:val="32"/>
+        </w:rPr>
       </w:pPr>
       <w:bookmarkStart w:id="5" w:name="exercice-2-le-diagramme-dishikawa-1h30"/>
       <w:bookmarkEnd w:id="2"/>
       <w:bookmarkEnd w:id="4"/>
       <w:r>
+        <w:br w:type="page"/>
+      </w:r>
+    </w:p>
+    <w:p>
+      <w:pPr>
+        <w:pStyle w:val="Titre2"/>
+      </w:pPr>
+      <w:r>
+        <w:lastRenderedPageBreak/>
         <w:t xml:space="preserve">3. </w:t>
       </w:r>
       <w:proofErr w:type="spellStart"/>

</xml_diff>